<commit_message>
SCJ-D-26-00070R1 minor revision: keywords, abbreviation first-use fixes, Figure 2 methods note, reviewer line edits
Co-Authored-By: Tatsuki Onishi <bougtoir@gmail.com>
</commit_message>
<xml_diff>
--- a/wada-tue-scoping-review/manuscripts/SCJ_Title_Page.docx
+++ b/wada-tue-scoping-review/manuscripts/SCJ_Title_Page.docx
@@ -8,10 +8,11 @@
       </w:pPr>
       <w:r>
         <w:rPr>
+          <w:rFonts w:ascii="Times New Roman" w:hAnsi="Times New Roman" w:eastAsia="Times New Roman"/>
           <w:b/>
-          <w:sz w:val="28"/>
+          <w:sz w:val="24"/>
         </w:rPr>
-        <w:t>Mind the Gap: A Scoping Review of Discrepancies Between WADA Therapeutic Use Exemptions and Current Clinical Practice Guidelines</w:t>
+        <w:t>Mind the Gap: A Scoping Review of Discrepancies Between WADA Therapeutic Use Exemption and Current Clinical Practice Guidelines</w:t>
       </w:r>
     </w:p>
     <w:p/>
@@ -112,10 +113,11 @@
       </w:pPr>
       <w:r>
         <w:rPr>
+          <w:rFonts w:ascii="Times New Roman" w:hAnsi="Times New Roman" w:eastAsia="Times New Roman"/>
           <w:b/>
-          <w:sz w:val="28"/>
+          <w:sz w:val="24"/>
         </w:rPr>
-        <w:t>Mind the Gap: A Scoping Review of Discrepancies Between WADA Therapeutic Use Exemptions and Current Clinical Practice Guidelines</w:t>
+        <w:t>Mind the Gap: A Scoping Review of Discrepancies Between WADA Therapeutic Use Exemption and Current Clinical Practice Guidelines</w:t>
       </w:r>
     </w:p>
     <w:p/>
@@ -138,16 +140,11 @@
     <w:p>
       <w:r>
         <w:rPr>
+          <w:rFonts w:ascii="Times New Roman" w:hAnsi="Times New Roman" w:eastAsia="Times New Roman"/>
           <w:b/>
-          <w:sz w:val="20"/>
+          <w:sz w:val="24"/>
         </w:rPr>
-        <w:t xml:space="preserve">Keywords: </w:t>
-      </w:r>
-      <w:r>
-        <w:rPr>
-          <w:sz w:val="20"/>
-        </w:rPr>
-        <w:t>therapeutic use exemption; anti-doping; clinical practice guidelines; scoping review; prohibited list; athlete health</w:t>
+        <w:t>Keywords: stimulant medications; exercise-induced bronchoconstriction; glucocorticoids; hypogonadism; sports medicine; medication management</w:t>
       </w:r>
     </w:p>
     <w:sectPr>

</xml_diff>